<commit_message>
chore: update test scripts and omml test files
</commit_message>
<xml_diff>
--- a/test_final_omml.docx
+++ b/test_final_omml.docx
@@ -1,5 +1,86 @@
 
-<file path=word/document.xml><?xml version="1.0" encoding="UTF-8" standalone="yes"?><w:document mc:Ignorable="w14 w15 wp14" xmlns:wpc="http://schemas.microsoft.com/office/word/2010/wordprocessingCanvas" xmlns:mc="http://schemas.openxmlformats.org/markup-compatibility/2006" xmlns:o="urn:schemas-microsoft-com:office:office" xmlns:r="http://schemas.openxmlformats.org/officeDocument/2006/relationships" xmlns:m="http://schemas.openxmlformats.org/officeDocument/2006/math" xmlns:v="urn:schemas-microsoft-com:vml" xmlns:wp14="http://schemas.microsoft.com/office/word/2010/wordprocessingDrawing" xmlns:wp="http://schemas.openxmlformats.org/drawingml/2006/wordprocessingDrawing" xmlns:w10="urn:schemas-microsoft-com:office:word" xmlns:w="http://schemas.openxmlformats.org/wordprocessingml/2006/main" xmlns:w14="http://schemas.microsoft.com/office/word/2010/wordml" xmlns:w15="http://schemas.microsoft.com/office/word/2012/wordml" xmlns:wpg="http://schemas.microsoft.com/office/word/2010/wordprocessingGroup" xmlns:wpi="http://schemas.microsoft.com/office/word/2010/wordprocessingInk" xmlns:wne="http://schemas.microsoft.com/office/word/2006/wordml" xmlns:wps="http://schemas.microsoft.com/office/word/2010/wordprocessingShape" xmlns:cx="http://schemas.microsoft.com/office/drawing/2014/chartex" xmlns:cx1="http://schemas.microsoft.com/office/drawing/2015/9/8/chartex" xmlns:cx2="http://schemas.microsoft.com/office/drawing/2015/10/21/chartex" xmlns:cx3="http://schemas.microsoft.com/office/drawing/2016/5/9/chartex" xmlns:cx4="http://schemas.microsoft.com/office/drawing/2016/5/10/chartex" xmlns:cx5="http://schemas.microsoft.com/office/drawing/2016/5/11/chartex" xmlns:cx6="http://schemas.microsoft.com/office/drawing/2016/5/12/chartex" xmlns:cx7="http://schemas.microsoft.com/office/drawing/2016/5/13/chartex" xmlns:cx8="http://schemas.microsoft.com/office/drawing/2016/5/14/chartex" xmlns:aink="http://schemas.microsoft.com/office/drawing/2016/ink" xmlns:am3d="http://schemas.microsoft.com/office/drawing/2017/model3d" xmlns:w16cex="http://schemas.microsoft.com/office/word/2018/wordml/cex" xmlns:w16cid="http://schemas.microsoft.com/office/word/2016/wordml/cid" xmlns:w16="http://schemas.microsoft.com/office/word/2018/wordml" xmlns:w16sdtdh="http://schemas.microsoft.com/office/word/2020/wordml/sdtdatahash" xmlns:w16se="http://schemas.microsoft.com/office/word/2015/wordml/symex"><w:body><w:p><w:pPr><w:spacing w:after="120" w:before="240"/></w:pPr><w:r><w:rPr><w:b/><w:bCs/><w:sz w:val="24"/><w:szCs w:val="24"/></w:rPr><w:t xml:space="preserve">1. </w:t></w:r><w:r><w:rPr><w:b/><w:bCs/><w:sz w:val="24"/><w:szCs w:val="24"/></w:rPr><w:t xml:space="preserve">Hisoblang: </w:t></w:r><<m:oMath xmlns:m="http://schemas.openxmlformats.org/officeDocument/2006/math" xmlns:w="http://schemas.openxmlformats.org/wordprocessingml/2006/main"><m:rad><m:radPr><m:degHide m:val="on"/></m:radPr><m:deg/><m:e><m:r><m:t xml:space="preserve">81</m:t></m:r></m:e></m:rad></m:oMath>/><w:r><w:rPr><w:b/><w:bCs/><w:sz w:val="24"/><w:szCs w:val="24"/></w:rPr><w:t xml:space="preserve"> va yana </w:t></w:r><<m:oMath xmlns:m="http://schemas.openxmlformats.org/officeDocument/2006/math" xmlns:w="http://schemas.openxmlformats.org/wordprocessingml/2006/main"><m:f><m:fPr><m:type m:val="bar"/></m:fPr><m:num><m:r><m:t xml:space="preserve">1</m:t></m:r></m:num><m:den><m:r><m:t xml:space="preserve">2</m:t></m:r></m:den></m:f></m:oMath>/><w:r><w:rPr><w:b/><w:bCs/><w:sz w:val="24"/><w:szCs w:val="24"/></w:rPr><w:t xml:space="preserve"> qismi.</w:t></w:r></w:p><w:sectPr><w:pgSz w:w="11906" w:h="16838" w:orient="portrait"/><w:pgMar w:top="1440" w:right="1440" w:bottom="1440" w:left="1440" w:header="708" w:footer="708" w:gutter="0"/><w:pgNumType/><w:docGrid w:linePitch="360"/></w:sectPr></w:body></w:document>
+<file path=word/document.xml><?xml version="1.0" encoding="utf-8"?>
+<w:document xmlns:wpc="http://schemas.microsoft.com/office/word/2010/wordprocessingCanvas" xmlns:mc="http://schemas.openxmlformats.org/markup-compatibility/2006" xmlns:o="urn:schemas-microsoft-com:office:office" xmlns:r="http://schemas.openxmlformats.org/officeDocument/2006/relationships" xmlns:m="http://schemas.openxmlformats.org/officeDocument/2006/math" xmlns:v="urn:schemas-microsoft-com:vml" xmlns:wp14="http://schemas.microsoft.com/office/word/2010/wordprocessingDrawing" xmlns:wp="http://schemas.openxmlformats.org/drawingml/2006/wordprocessingDrawing" xmlns:w10="urn:schemas-microsoft-com:office:word" xmlns:w="http://schemas.openxmlformats.org/wordprocessingml/2006/main" xmlns:w14="http://schemas.microsoft.com/office/word/2010/wordml" xmlns:w15="http://schemas.microsoft.com/office/word/2012/wordml" xmlns:wpg="http://schemas.microsoft.com/office/word/2010/wordprocessingGroup" xmlns:wpi="http://schemas.microsoft.com/office/word/2010/wordprocessingInk" xmlns:wne="http://schemas.microsoft.com/office/word/2006/wordml" xmlns:wps="http://schemas.microsoft.com/office/word/2010/wordprocessingShape" xmlns:cx="http://schemas.microsoft.com/office/drawing/2014/chartex" xmlns:cx1="http://schemas.microsoft.com/office/drawing/2015/9/8/chartex" xmlns:cx2="http://schemas.microsoft.com/office/drawing/2015/10/21/chartex" xmlns:cx3="http://schemas.microsoft.com/office/drawing/2016/5/9/chartex" xmlns:cx4="http://schemas.microsoft.com/office/drawing/2016/5/10/chartex" xmlns:cx5="http://schemas.microsoft.com/office/drawing/2016/5/11/chartex" xmlns:cx6="http://schemas.microsoft.com/office/drawing/2016/5/12/chartex" xmlns:cx7="http://schemas.microsoft.com/office/drawing/2016/5/13/chartex" xmlns:cx8="http://schemas.microsoft.com/office/drawing/2016/5/14/chartex" xmlns:aink="http://schemas.microsoft.com/office/drawing/2016/ink" xmlns:am3d="http://schemas.microsoft.com/office/drawing/2017/model3d" xmlns:w16cex="http://schemas.microsoft.com/office/word/2018/wordml/cex" xmlns:w16cid="http://schemas.microsoft.com/office/word/2016/wordml/cid" xmlns:w16="http://schemas.microsoft.com/office/word/2018/wordml" xmlns:w16sdtdh="http://schemas.microsoft.com/office/word/2020/wordml/sdtdatahash" xmlns:w16se="http://schemas.microsoft.com/office/word/2015/wordml/symex" mc:Ignorable="w14 w15 wp14">
+  <w:body>
+    <w:p>
+      <w:pPr>
+        <w:spacing w:after="120" w:before="240"/>
+      </w:pPr>
+      <w:r>
+        <w:rPr>
+          <w:b/>
+          <w:bCs/>
+          <w:sz w:val="24"/>
+          <w:szCs w:val="24"/>
+        </w:rPr>
+        <w:t xml:space="preserve">1. </w:t>
+      </w:r>
+      <w:r>
+        <w:rPr>
+          <w:b/>
+          <w:bCs/>
+          <w:sz w:val="24"/>
+          <w:szCs w:val="24"/>
+        </w:rPr>
+        <w:t xml:space="preserve">Hisoblang: </w:t>
+      </w:r>
+      <m:oMath xmlns:m="http://schemas.openxmlformats.org/officeDocument/2006/math" xmlns:w="http://schemas.openxmlformats.org/wordprocessingml/2006/main">
+        <m:rad>
+          <m:radPr>
+            <m:degHide m:val="on"/>
+          </m:radPr>
+          <m:deg/>
+          <m:e>
+            <m:r>
+              <m:t xml:space="preserve">81</m:t>
+            </m:r>
+          </m:e>
+        </m:rad>
+      </m:oMath>
+      <w:r>
+        <w:rPr>
+          <w:b/>
+          <w:bCs/>
+          <w:sz w:val="24"/>
+          <w:szCs w:val="24"/>
+        </w:rPr>
+        <w:t xml:space="preserve"> va yana </w:t>
+      </w:r>
+      <m:oMath xmlns:m="http://schemas.openxmlformats.org/officeDocument/2006/math" xmlns:w="http://schemas.openxmlformats.org/wordprocessingml/2006/main">
+        <m:f>
+          <m:fPr>
+            <m:type m:val="bar"/>
+          </m:fPr>
+          <m:num>
+            <m:r>
+              <m:t xml:space="preserve">1</m:t>
+            </m:r>
+          </m:num>
+          <m:den>
+            <m:r>
+              <m:t xml:space="preserve">2</m:t>
+            </m:r>
+          </m:den>
+        </m:f>
+      </m:oMath>
+      <w:r>
+        <w:rPr>
+          <w:b/>
+          <w:bCs/>
+          <w:sz w:val="24"/>
+          <w:szCs w:val="24"/>
+        </w:rPr>
+        <w:t xml:space="preserve"> qismi.</w:t>
+      </w:r>
+    </w:p>
+    <w:sectPr>
+      <w:pgSz w:w="11906" w:h="16838" w:orient="portrait"/>
+      <w:pgMar w:top="1440" w:right="1440" w:bottom="1440" w:left="1440" w:header="708" w:footer="708" w:gutter="0"/>
+      <w:pgNumType/>
+      <w:docGrid w:linePitch="360"/>
+    </w:sectPr>
+  </w:body>
+</w:document>
 </file>
 
 <file path=word/comments.xml><?xml version="1.0" encoding="utf-8"?>

</xml_diff>